<commit_message>
Rückmeldung 28.10.: Schriftgröße 27, Eingangsfrage ohne Fachbegriff, präzise Beurteilen-Frage, Berater-Frage mit Risiko (8C Stunde 2, 8D Folien, Sequenz, CLAUDE.md)
Co-Authored-By: Claude Sonnet 5.5 <noreply@anthropic.com>
Claude-Session: https://claude.ai/code/session_01GXwmzpsaCraifErTDddPwN
</commit_message>
<xml_diff>
--- a/Geschichte_8/Stunde2_Nationalversammlung/Schnipsel_Karikatur_Dreischritt_und_Hilfekarten.docx
+++ b/Geschichte_8/Stunde2_Nationalversammlung/Schnipsel_Karikatur_Dreischritt_und_Hilfekarten.docx
@@ -318,30 +318,30 @@
                 <w:sz w:val="19"/>
                 <w:szCs w:val="19"/>
               </w:rPr>
-              <w:t xml:space="preserve">Ist das berechtigt?</w:t>
-            </w:r>
-          </w:p>
-          <w:p>
-            <w:pPr>
-              <w:spacing w:after="20" w:before="0"/>
-            </w:pPr>
-            <w:r>
-              <w:rPr>
-                <w:rFonts w:ascii="Calibri" w:cs="Calibri" w:eastAsia="Calibri" w:hAnsi="Calibri"/>
-                <w:color w:val="000000"/>
-                <w:sz w:val="19"/>
-                <w:szCs w:val="19"/>
-              </w:rPr>
-              <w:t xml:space="preserve">• </w:t>
-            </w:r>
-            <w:r>
-              <w:rPr>
-                <w:rFonts w:ascii="Calibri" w:cs="Calibri" w:eastAsia="Calibri" w:hAnsi="Calibri"/>
-                <w:color w:val="000000"/>
-                <w:sz w:val="19"/>
-                <w:szCs w:val="19"/>
-              </w:rPr>
-              <w:t xml:space="preserve">Die Darstellung ist (nicht) berechtigt, weil …</w:t>
+              <w:t xml:space="preserve">Stimmt das Bild? Was will er?</w:t>
+            </w:r>
+          </w:p>
+          <w:p>
+            <w:pPr>
+              <w:spacing w:after="20" w:before="0"/>
+            </w:pPr>
+            <w:r>
+              <w:rPr>
+                <w:rFonts w:ascii="Calibri" w:cs="Calibri" w:eastAsia="Calibri" w:hAnsi="Calibri"/>
+                <w:color w:val="000000"/>
+                <w:sz w:val="19"/>
+                <w:szCs w:val="19"/>
+              </w:rPr>
+              <w:t xml:space="preserve">• </w:t>
+            </w:r>
+            <w:r>
+              <w:rPr>
+                <w:rFonts w:ascii="Calibri" w:cs="Calibri" w:eastAsia="Calibri" w:hAnsi="Calibri"/>
+                <w:color w:val="000000"/>
+                <w:sz w:val="19"/>
+                <w:szCs w:val="19"/>
+              </w:rPr>
+              <w:t xml:space="preserve">Das stimmt (nicht) mit unserem Wissen überein, weil …</w:t>
             </w:r>
           </w:p>
           <w:p>
@@ -709,30 +709,30 @@
                 <w:sz w:val="19"/>
                 <w:szCs w:val="19"/>
               </w:rPr>
-              <w:t xml:space="preserve">Ist das berechtigt?</w:t>
-            </w:r>
-          </w:p>
-          <w:p>
-            <w:pPr>
-              <w:spacing w:after="20" w:before="0"/>
-            </w:pPr>
-            <w:r>
-              <w:rPr>
-                <w:rFonts w:ascii="Calibri" w:cs="Calibri" w:eastAsia="Calibri" w:hAnsi="Calibri"/>
-                <w:color w:val="000000"/>
-                <w:sz w:val="19"/>
-                <w:szCs w:val="19"/>
-              </w:rPr>
-              <w:t xml:space="preserve">• </w:t>
-            </w:r>
-            <w:r>
-              <w:rPr>
-                <w:rFonts w:ascii="Calibri" w:cs="Calibri" w:eastAsia="Calibri" w:hAnsi="Calibri"/>
-                <w:color w:val="000000"/>
-                <w:sz w:val="19"/>
-                <w:szCs w:val="19"/>
-              </w:rPr>
-              <w:t xml:space="preserve">Die Darstellung ist (nicht) berechtigt, weil …</w:t>
+              <w:t xml:space="preserve">Stimmt das Bild? Was will er?</w:t>
+            </w:r>
+          </w:p>
+          <w:p>
+            <w:pPr>
+              <w:spacing w:after="20" w:before="0"/>
+            </w:pPr>
+            <w:r>
+              <w:rPr>
+                <w:rFonts w:ascii="Calibri" w:cs="Calibri" w:eastAsia="Calibri" w:hAnsi="Calibri"/>
+                <w:color w:val="000000"/>
+                <w:sz w:val="19"/>
+                <w:szCs w:val="19"/>
+              </w:rPr>
+              <w:t xml:space="preserve">• </w:t>
+            </w:r>
+            <w:r>
+              <w:rPr>
+                <w:rFonts w:ascii="Calibri" w:cs="Calibri" w:eastAsia="Calibri" w:hAnsi="Calibri"/>
+                <w:color w:val="000000"/>
+                <w:sz w:val="19"/>
+                <w:szCs w:val="19"/>
+              </w:rPr>
+              <w:t xml:space="preserve">Das stimmt (nicht) mit unserem Wissen überein, weil …</w:t>
             </w:r>
           </w:p>
           <w:p>
@@ -1106,30 +1106,30 @@
                 <w:sz w:val="19"/>
                 <w:szCs w:val="19"/>
               </w:rPr>
-              <w:t xml:space="preserve">Ist das berechtigt?</w:t>
-            </w:r>
-          </w:p>
-          <w:p>
-            <w:pPr>
-              <w:spacing w:after="20" w:before="0"/>
-            </w:pPr>
-            <w:r>
-              <w:rPr>
-                <w:rFonts w:ascii="Calibri" w:cs="Calibri" w:eastAsia="Calibri" w:hAnsi="Calibri"/>
-                <w:color w:val="000000"/>
-                <w:sz w:val="19"/>
-                <w:szCs w:val="19"/>
-              </w:rPr>
-              <w:t xml:space="preserve">• </w:t>
-            </w:r>
-            <w:r>
-              <w:rPr>
-                <w:rFonts w:ascii="Calibri" w:cs="Calibri" w:eastAsia="Calibri" w:hAnsi="Calibri"/>
-                <w:color w:val="000000"/>
-                <w:sz w:val="19"/>
-                <w:szCs w:val="19"/>
-              </w:rPr>
-              <w:t xml:space="preserve">Die Darstellung ist (nicht) berechtigt, weil …</w:t>
+              <w:t xml:space="preserve">Stimmt das Bild? Was will er?</w:t>
+            </w:r>
+          </w:p>
+          <w:p>
+            <w:pPr>
+              <w:spacing w:after="20" w:before="0"/>
+            </w:pPr>
+            <w:r>
+              <w:rPr>
+                <w:rFonts w:ascii="Calibri" w:cs="Calibri" w:eastAsia="Calibri" w:hAnsi="Calibri"/>
+                <w:color w:val="000000"/>
+                <w:sz w:val="19"/>
+                <w:szCs w:val="19"/>
+              </w:rPr>
+              <w:t xml:space="preserve">• </w:t>
+            </w:r>
+            <w:r>
+              <w:rPr>
+                <w:rFonts w:ascii="Calibri" w:cs="Calibri" w:eastAsia="Calibri" w:hAnsi="Calibri"/>
+                <w:color w:val="000000"/>
+                <w:sz w:val="19"/>
+                <w:szCs w:val="19"/>
+              </w:rPr>
+              <w:t xml:space="preserve">Das stimmt (nicht) mit unserem Wissen überein, weil …</w:t>
             </w:r>
           </w:p>
           <w:p>
@@ -1497,30 +1497,30 @@
                 <w:sz w:val="19"/>
                 <w:szCs w:val="19"/>
               </w:rPr>
-              <w:t xml:space="preserve">Ist das berechtigt?</w:t>
-            </w:r>
-          </w:p>
-          <w:p>
-            <w:pPr>
-              <w:spacing w:after="20" w:before="0"/>
-            </w:pPr>
-            <w:r>
-              <w:rPr>
-                <w:rFonts w:ascii="Calibri" w:cs="Calibri" w:eastAsia="Calibri" w:hAnsi="Calibri"/>
-                <w:color w:val="000000"/>
-                <w:sz w:val="19"/>
-                <w:szCs w:val="19"/>
-              </w:rPr>
-              <w:t xml:space="preserve">• </w:t>
-            </w:r>
-            <w:r>
-              <w:rPr>
-                <w:rFonts w:ascii="Calibri" w:cs="Calibri" w:eastAsia="Calibri" w:hAnsi="Calibri"/>
-                <w:color w:val="000000"/>
-                <w:sz w:val="19"/>
-                <w:szCs w:val="19"/>
-              </w:rPr>
-              <w:t xml:space="preserve">Die Darstellung ist (nicht) berechtigt, weil …</w:t>
+              <w:t xml:space="preserve">Stimmt das Bild? Was will er?</w:t>
+            </w:r>
+          </w:p>
+          <w:p>
+            <w:pPr>
+              <w:spacing w:after="20" w:before="0"/>
+            </w:pPr>
+            <w:r>
+              <w:rPr>
+                <w:rFonts w:ascii="Calibri" w:cs="Calibri" w:eastAsia="Calibri" w:hAnsi="Calibri"/>
+                <w:color w:val="000000"/>
+                <w:sz w:val="19"/>
+                <w:szCs w:val="19"/>
+              </w:rPr>
+              <w:t xml:space="preserve">• </w:t>
+            </w:r>
+            <w:r>
+              <w:rPr>
+                <w:rFonts w:ascii="Calibri" w:cs="Calibri" w:eastAsia="Calibri" w:hAnsi="Calibri"/>
+                <w:color w:val="000000"/>
+                <w:sz w:val="19"/>
+                <w:szCs w:val="19"/>
+              </w:rPr>
+              <w:t xml:space="preserve">Das stimmt (nicht) mit unserem Wissen überein, weil …</w:t>
             </w:r>
           </w:p>
           <w:p>
@@ -1894,30 +1894,30 @@
                 <w:sz w:val="19"/>
                 <w:szCs w:val="19"/>
               </w:rPr>
-              <w:t xml:space="preserve">Ist das berechtigt?</w:t>
-            </w:r>
-          </w:p>
-          <w:p>
-            <w:pPr>
-              <w:spacing w:after="20" w:before="0"/>
-            </w:pPr>
-            <w:r>
-              <w:rPr>
-                <w:rFonts w:ascii="Calibri" w:cs="Calibri" w:eastAsia="Calibri" w:hAnsi="Calibri"/>
-                <w:color w:val="000000"/>
-                <w:sz w:val="19"/>
-                <w:szCs w:val="19"/>
-              </w:rPr>
-              <w:t xml:space="preserve">• </w:t>
-            </w:r>
-            <w:r>
-              <w:rPr>
-                <w:rFonts w:ascii="Calibri" w:cs="Calibri" w:eastAsia="Calibri" w:hAnsi="Calibri"/>
-                <w:color w:val="000000"/>
-                <w:sz w:val="19"/>
-                <w:szCs w:val="19"/>
-              </w:rPr>
-              <w:t xml:space="preserve">Die Darstellung ist (nicht) berechtigt, weil …</w:t>
+              <w:t xml:space="preserve">Stimmt das Bild? Was will er?</w:t>
+            </w:r>
+          </w:p>
+          <w:p>
+            <w:pPr>
+              <w:spacing w:after="20" w:before="0"/>
+            </w:pPr>
+            <w:r>
+              <w:rPr>
+                <w:rFonts w:ascii="Calibri" w:cs="Calibri" w:eastAsia="Calibri" w:hAnsi="Calibri"/>
+                <w:color w:val="000000"/>
+                <w:sz w:val="19"/>
+                <w:szCs w:val="19"/>
+              </w:rPr>
+              <w:t xml:space="preserve">• </w:t>
+            </w:r>
+            <w:r>
+              <w:rPr>
+                <w:rFonts w:ascii="Calibri" w:cs="Calibri" w:eastAsia="Calibri" w:hAnsi="Calibri"/>
+                <w:color w:val="000000"/>
+                <w:sz w:val="19"/>
+                <w:szCs w:val="19"/>
+              </w:rPr>
+              <w:t xml:space="preserve">Das stimmt (nicht) mit unserem Wissen überein, weil …</w:t>
             </w:r>
           </w:p>
           <w:p>
@@ -2285,30 +2285,30 @@
                 <w:sz w:val="19"/>
                 <w:szCs w:val="19"/>
               </w:rPr>
-              <w:t xml:space="preserve">Ist das berechtigt?</w:t>
-            </w:r>
-          </w:p>
-          <w:p>
-            <w:pPr>
-              <w:spacing w:after="20" w:before="0"/>
-            </w:pPr>
-            <w:r>
-              <w:rPr>
-                <w:rFonts w:ascii="Calibri" w:cs="Calibri" w:eastAsia="Calibri" w:hAnsi="Calibri"/>
-                <w:color w:val="000000"/>
-                <w:sz w:val="19"/>
-                <w:szCs w:val="19"/>
-              </w:rPr>
-              <w:t xml:space="preserve">• </w:t>
-            </w:r>
-            <w:r>
-              <w:rPr>
-                <w:rFonts w:ascii="Calibri" w:cs="Calibri" w:eastAsia="Calibri" w:hAnsi="Calibri"/>
-                <w:color w:val="000000"/>
-                <w:sz w:val="19"/>
-                <w:szCs w:val="19"/>
-              </w:rPr>
-              <w:t xml:space="preserve">Die Darstellung ist (nicht) berechtigt, weil …</w:t>
+              <w:t xml:space="preserve">Stimmt das Bild? Was will er?</w:t>
+            </w:r>
+          </w:p>
+          <w:p>
+            <w:pPr>
+              <w:spacing w:after="20" w:before="0"/>
+            </w:pPr>
+            <w:r>
+              <w:rPr>
+                <w:rFonts w:ascii="Calibri" w:cs="Calibri" w:eastAsia="Calibri" w:hAnsi="Calibri"/>
+                <w:color w:val="000000"/>
+                <w:sz w:val="19"/>
+                <w:szCs w:val="19"/>
+              </w:rPr>
+              <w:t xml:space="preserve">• </w:t>
+            </w:r>
+            <w:r>
+              <w:rPr>
+                <w:rFonts w:ascii="Calibri" w:cs="Calibri" w:eastAsia="Calibri" w:hAnsi="Calibri"/>
+                <w:color w:val="000000"/>
+                <w:sz w:val="19"/>
+                <w:szCs w:val="19"/>
+              </w:rPr>
+              <w:t xml:space="preserve">Das stimmt (nicht) mit unserem Wissen überein, weil …</w:t>
             </w:r>
           </w:p>
           <w:p>
@@ -2734,7 +2734,7 @@
                 <w:sz w:val="22"/>
                 <w:szCs w:val="22"/>
               </w:rPr>
-              <w:t xml:space="preserve">Der Zeichner will, dass …  Er übertreibt, weil …  Das Bild ist (nicht) berechtigt, denn der Dritte Stand (Bauern und Bürger) …</w:t>
+              <w:t xml:space="preserve">Der Zeichner will, dass …  Er übertreibt, weil …  Das stimmt (nicht) mit unserem Wissen überein, denn der Dritte Stand (Bauern und Bürger) …</w:t>
             </w:r>
           </w:p>
         </w:tc>
@@ -2882,7 +2882,7 @@
                 <w:sz w:val="22"/>
                 <w:szCs w:val="22"/>
               </w:rPr>
-              <w:t xml:space="preserve">Der Zeichner will, dass die Betrachter ______ empfinden. Das ist (nicht) berechtigt, weil ______ und ______ keine Steuern zahlten.</w:t>
+              <w:t xml:space="preserve">Der Zeichner will, dass die Betrachter ______ empfinden. Das stimmt mit unserem Wissen überein, weil ______ und ______ keine Steuern zahlten. Er übertreibt, weil ______.</w:t>
             </w:r>
           </w:p>
         </w:tc>

</xml_diff>